<commit_message>
feat: corrige fluxo operacional de cargas e viagens
</commit_message>
<xml_diff>
--- a/docs/feedback/2026-07-09-validacao-core-todas-telas-diagramado.docx
+++ b/docs/feedback/2026-07-09-validacao-core-todas-telas-diagramado.docx
@@ -10206,21 +10206,7 @@
         <w:spacing w:after="80"/>
       </w:pPr>
       <w:r>
-        <w:rPr>
-          <w:rFonts w:ascii="Calibri" w:hAnsi="Calibri"/>
-          <w:b/>
-          <w:color w:val="6E1027"/>
-          <w:sz w:val="21"/>
-        </w:rPr>
-        <w:t xml:space="preserve">Tela / área: </w:t>
-      </w:r>
-      <w:r>
-        <w:rPr>
-          <w:rFonts w:ascii="Calibri" w:hAnsi="Calibri"/>
-          <w:color w:val="1E1E22"/>
-          <w:sz w:val="21"/>
-        </w:rPr>
-        <w:t>Conferência de embarque com palete ou mercadoria avulsa e recebimento por volume.</w:t>
+        <w:t>Tela / área: conferência física no porto, embarque na embarcação, cross-docking e entrega por volume/palete.</w:t>
       </w:r>
     </w:p>
     <w:p>
@@ -10641,13 +10627,22 @@
         <w:keepLines/>
       </w:pPr>
       <w:r>
+        <w:t>REQ-15-01  Na conferência no porto, o primeiro bipe muda o volume de cadastrado para conferido; com palete, selecionar o palete, alocar NF/DC, registrar quantidades e composição completa/parcial.</w:t>
+      </w:r>
+    </w:p>
+    <w:p>
+      <w:pPr>
+        <w:pStyle w:val="Requisito"/>
+        <w:keepLines/>
+      </w:pPr>
+      <w:r>
         <w:rPr>
           <w:rFonts w:ascii="Calibri" w:hAnsi="Calibri"/>
           <w:b/>
           <w:color w:val="B89452"/>
           <w:sz w:val="18"/>
         </w:rPr>
-        <w:t xml:space="preserve">REQ-15-01  </w:t>
+        <w:t xml:space="preserve">REQ-15-02  </w:t>
       </w:r>
       <w:r>
         <w:rPr>
@@ -10655,7 +10650,7 @@
           <w:color w:val="1E1E22"/>
           <w:sz w:val="21"/>
         </w:rPr>
-        <w:t>Na conferência com palete, selecionar o palete, alocar e conferir NF/DC, registrar quantidades e status completo/parcial.</w:t>
+        <w:t>Usar a etiqueta do palete como identificação das NF/DC nele alocadas.</w:t>
       </w:r>
     </w:p>
     <w:p>
@@ -10664,13 +10659,46 @@
         <w:keepLines/>
       </w:pPr>
       <w:r>
+        <w:t>REQ-15-03  Na mercadoria avulsa, etiquetar e bipar cada volume. No porto, o bipe registra conferido; na embarcação/cross-docking, registra embarcado.</w:t>
+      </w:r>
+    </w:p>
+    <w:p>
+      <w:pPr>
+        <w:pStyle w:val="Requisito"/>
+      </w:pPr>
+      <w:r>
+        <w:t>REQ-15-04  A máquina de estados oficial é cadastrado → conferido → embarcado → entregue. No cross-docking, cadastrado → embarcado. Divergente é exceção por extravio, avaria ou diferença total/parcial.</w:t>
+      </w:r>
+    </w:p>
+    <w:p>
+      <w:pPr>
+        <w:pStyle w:val="Requisito"/>
+      </w:pPr>
+      <w:r>
+        <w:t>REQ-15-05  Recebido, reconferido e desembarcado não são estados operacionais. Registros antigos permanecem somente na trilha histórica imutável e são apresentados com a semântica atual.</w:t>
+      </w:r>
+    </w:p>
+    <w:p>
+      <w:pPr>
+        <w:pStyle w:val="Heading2"/>
+      </w:pPr>
+      <w:r>
+        <w:t>Critérios de aceite</w:t>
+      </w:r>
+    </w:p>
+    <w:p>
+      <w:pPr>
+        <w:pStyle w:val="CriterioAceite"/>
+        <w:keepLines/>
+      </w:pPr>
+      <w:r>
         <w:rPr>
           <w:rFonts w:ascii="Calibri" w:hAnsi="Calibri"/>
           <w:b/>
           <w:color w:val="B89452"/>
           <w:sz w:val="18"/>
         </w:rPr>
-        <w:t xml:space="preserve">REQ-15-02  </w:t>
+        <w:t xml:space="preserve">CA-15-01  </w:t>
       </w:r>
       <w:r>
         <w:rPr>
@@ -10678,12 +10706,12 @@
           <w:color w:val="1E1E22"/>
           <w:sz w:val="21"/>
         </w:rPr>
-        <w:t>Usar a etiqueta do palete como identificação das NF/DC nele alocadas.</w:t>
-      </w:r>
-    </w:p>
-    <w:p>
-      <w:pPr>
-        <w:pStyle w:val="Requisito"/>
+        <w:t>A soma de volumes conferidos não ultrapassa a quantidade informada no documento sem gerar divergência explícita.</w:t>
+      </w:r>
+    </w:p>
+    <w:p>
+      <w:pPr>
+        <w:pStyle w:val="CriterioAceite"/>
         <w:keepLines/>
       </w:pPr>
       <w:r>
@@ -10693,7 +10721,7 @@
           <w:color w:val="B89452"/>
           <w:sz w:val="18"/>
         </w:rPr>
-        <w:t xml:space="preserve">REQ-15-03  </w:t>
+        <w:t xml:space="preserve">CA-15-02  </w:t>
       </w:r>
       <w:r>
         <w:rPr>
@@ -10701,15 +10729,7 @@
           <w:color w:val="1E1E22"/>
           <w:sz w:val="21"/>
         </w:rPr>
-        <w:t>Na conferência sem palete, selecionar mercadoria avulsa/porão, registrar quantidade, etiquetar e bipar cada volume.</w:t>
-      </w:r>
-    </w:p>
-    <w:p>
-      <w:pPr>
-        <w:pStyle w:val="Heading2"/>
-      </w:pPr>
-      <w:r>
-        <w:t>Critérios de aceite</w:t>
+        <w:t>O palete alterna entre completo e parcialmente completo de acordo com a conferência registrada.</w:t>
       </w:r>
     </w:p>
     <w:p>
@@ -10724,7 +10744,7 @@
           <w:color w:val="B89452"/>
           <w:sz w:val="18"/>
         </w:rPr>
-        <w:t xml:space="preserve">CA-15-01  </w:t>
+        <w:t xml:space="preserve">CA-15-03  </w:t>
       </w:r>
       <w:r>
         <w:rPr>
@@ -10732,7 +10752,7 @@
           <w:color w:val="1E1E22"/>
           <w:sz w:val="21"/>
         </w:rPr>
-        <w:t>A soma de volumes conferidos não ultrapassa a quantidade informada no documento sem gerar divergência explícita.</w:t>
+        <w:t>A etiqueta do palete permite recuperar as NF/DC vinculadas.</w:t>
       </w:r>
     </w:p>
     <w:p>
@@ -10741,75 +10761,29 @@
         <w:keepLines/>
       </w:pPr>
       <w:r>
-        <w:rPr>
-          <w:rFonts w:ascii="Calibri" w:hAnsi="Calibri"/>
-          <w:b/>
-          <w:color w:val="B89452"/>
-          <w:sz w:val="18"/>
-        </w:rPr>
-        <w:t xml:space="preserve">CA-15-02  </w:t>
-      </w:r>
-      <w:r>
-        <w:rPr>
-          <w:rFonts w:ascii="Calibri" w:hAnsi="Calibri"/>
-          <w:color w:val="1E1E22"/>
-          <w:sz w:val="21"/>
-        </w:rPr>
-        <w:t>O palete alterna entre completo e parcialmente completo de acordo com a conferência registrada.</w:t>
+        <w:t>CA-15-04  No fluxo avulso, cada volume recebe etiqueta e leitura individual; o resultado é conferido no porto ou embarcado na embarcação/cross-docking.</w:t>
+      </w:r>
+    </w:p>
+    <w:p>
+      <w:pPr>
+        <w:pStyle w:val="Heading2"/>
+      </w:pPr>
+      <w:r>
+        <w:t>Nota de execução</w:t>
       </w:r>
     </w:p>
     <w:p>
       <w:pPr>
         <w:pStyle w:val="CriterioAceite"/>
-        <w:keepLines/>
-      </w:pPr>
-      <w:r>
-        <w:rPr>
-          <w:rFonts w:ascii="Calibri" w:hAnsi="Calibri"/>
-          <w:b/>
-          <w:color w:val="B89452"/>
-          <w:sz w:val="18"/>
-        </w:rPr>
-        <w:t xml:space="preserve">CA-15-03  </w:t>
-      </w:r>
-      <w:r>
-        <w:rPr>
-          <w:rFonts w:ascii="Calibri" w:hAnsi="Calibri"/>
-          <w:color w:val="1E1E22"/>
-          <w:sz w:val="21"/>
-        </w:rPr>
-        <w:t>A etiqueta do palete permite recuperar as NF/DC vinculadas.</w:t>
-      </w:r>
-    </w:p>
-    <w:p>
-      <w:pPr>
-        <w:pStyle w:val="CriterioAceite"/>
-        <w:keepLines/>
-      </w:pPr>
-      <w:r>
-        <w:rPr>
-          <w:rFonts w:ascii="Calibri" w:hAnsi="Calibri"/>
-          <w:b/>
-          <w:color w:val="B89452"/>
-          <w:sz w:val="18"/>
-        </w:rPr>
-        <w:t xml:space="preserve">CA-15-04  </w:t>
-      </w:r>
-      <w:r>
-        <w:rPr>
-          <w:rFonts w:ascii="Calibri" w:hAnsi="Calibri"/>
-          <w:color w:val="1E1E22"/>
-          <w:sz w:val="21"/>
-        </w:rPr>
-        <w:t>No fluxo avulso, cada volume recebe etiqueta e leitura individual antes de constar como recebido.</w:t>
-      </w:r>
-    </w:p>
-    <w:p>
-      <w:pPr>
-        <w:pStyle w:val="Heading2"/>
-      </w:pPr>
-      <w:r>
-        <w:t>Nota de execução</w:t>
+      </w:pPr>
+      <w:r>
+        <w:t>CA-15-05  Filtros, painéis, APIs, exportações e aplicativos de campo expõem somente cadastrado, conferido, embarcado, entregue e divergente.</w:t>
+      </w:r>
+    </w:p>
+    <w:p>
+      <w:pPr/>
+      <w:r>
+        <w:t>Decisão de fluxo confirmada em 04/ago/2026: o conferente do porto faz o bipe de conferido; o conferente da embarcação faz o bipe de embarcado; no cross-docking o volume pode ir diretamente de cadastrado para embarcado; a entrega concluída registra entregue.</w:t>
       </w:r>
     </w:p>
     <w:p>

</xml_diff>